<commit_message>
add pdf dir && finish lab5
</commit_message>
<xml_diff>
--- a/labs/lab_report/finished_report/266430069 段辉园 python实验报告五.docx
+++ b/labs/lab_report/finished_report/266430069 段辉园 python实验报告五.docx
@@ -1,6 +1,6 @@
 
 <file path=word/document.xml><?xml version="1.0" encoding="utf-8"?>
-<w:document xmlns:wpc="http://schemas.microsoft.com/office/word/2010/wordprocessingCanvas" xmlns:cx="http://schemas.microsoft.com/office/drawing/2014/chartex" xmlns:mc="http://schemas.openxmlformats.org/markup-compatibility/2006" xmlns:o="urn:schemas-microsoft-com:office:office" xmlns:r="http://schemas.openxmlformats.org/officeDocument/2006/relationships" xmlns:m="http://schemas.openxmlformats.org/officeDocument/2006/math" xmlns:v="urn:schemas-microsoft-com:vml" xmlns:wp14="http://schemas.microsoft.com/office/word/2010/wordprocessingDrawing" xmlns:wp="http://schemas.openxmlformats.org/drawingml/2006/wordprocessingDrawing" xmlns:w10="urn:schemas-microsoft-com:office:word" xmlns:w="http://schemas.openxmlformats.org/wordprocessingml/2006/main" xmlns:w14="http://schemas.microsoft.com/office/word/2010/wordml" xmlns:w15="http://schemas.microsoft.com/office/word/2012/wordml" xmlns:w16se="http://schemas.microsoft.com/office/word/2015/wordml/symex" xmlns:wpg="http://schemas.microsoft.com/office/word/2010/wordprocessingGroup" xmlns:wpi="http://schemas.microsoft.com/office/word/2010/wordprocessingInk" xmlns:wne="http://schemas.microsoft.com/office/word/2006/wordml" xmlns:wps="http://schemas.microsoft.com/office/word/2010/wordprocessingShape" mc:Ignorable="w14 w15 w16se wp14">
+<w:document xmlns:wpc="http://schemas.microsoft.com/office/word/2010/wordprocessingCanvas" xmlns:cx="http://schemas.microsoft.com/office/drawing/2014/chartex" xmlns:cx1="http://schemas.microsoft.com/office/drawing/2015/9/8/chartex" xmlns:cx2="http://schemas.microsoft.com/office/drawing/2015/10/21/chartex" xmlns:cx3="http://schemas.microsoft.com/office/drawing/2016/5/9/chartex" xmlns:cx4="http://schemas.microsoft.com/office/drawing/2016/5/10/chartex" xmlns:cx5="http://schemas.microsoft.com/office/drawing/2016/5/11/chartex" xmlns:cx6="http://schemas.microsoft.com/office/drawing/2016/5/12/chartex" xmlns:cx7="http://schemas.microsoft.com/office/drawing/2016/5/13/chartex" xmlns:cx8="http://schemas.microsoft.com/office/drawing/2016/5/14/chartex" xmlns:mc="http://schemas.openxmlformats.org/markup-compatibility/2006" xmlns:aink="http://schemas.microsoft.com/office/drawing/2016/ink" xmlns:am3d="http://schemas.microsoft.com/office/drawing/2017/model3d" xmlns:o="urn:schemas-microsoft-com:office:office" xmlns:oel="http://schemas.microsoft.com/office/2019/extlst" xmlns:r="http://schemas.openxmlformats.org/officeDocument/2006/relationships" xmlns:m="http://schemas.openxmlformats.org/officeDocument/2006/math" xmlns:v="urn:schemas-microsoft-com:vml" xmlns:wp14="http://schemas.microsoft.com/office/word/2010/wordprocessingDrawing" xmlns:wp="http://schemas.openxmlformats.org/drawingml/2006/wordprocessingDrawing" xmlns:w10="urn:schemas-microsoft-com:office:word" xmlns:w="http://schemas.openxmlformats.org/wordprocessingml/2006/main" xmlns:w14="http://schemas.microsoft.com/office/word/2010/wordml" xmlns:w15="http://schemas.microsoft.com/office/word/2012/wordml" xmlns:w16cex="http://schemas.microsoft.com/office/word/2018/wordml/cex" xmlns:w16cid="http://schemas.microsoft.com/office/word/2016/wordml/cid" xmlns:w16="http://schemas.microsoft.com/office/word/2018/wordml" xmlns:w16sdtdh="http://schemas.microsoft.com/office/word/2020/wordml/sdtdatahash" xmlns:w16se="http://schemas.microsoft.com/office/word/2015/wordml/symex" xmlns:wpg="http://schemas.microsoft.com/office/word/2010/wordprocessingGroup" xmlns:wpi="http://schemas.microsoft.com/office/word/2010/wordprocessingInk" xmlns:wne="http://schemas.microsoft.com/office/word/2006/wordml" xmlns:wps="http://schemas.microsoft.com/office/word/2010/wordprocessingShape" mc:Ignorable="w14 w15 w16se w16cid w16 w16cex w16sdtdh wp14">
   <w:body>
     <w:p>
       <w:pPr>
@@ -548,6 +548,274 @@
               <w:spacing w:line="276" w:lineRule="auto"/>
               <w:ind w:right="1123"/>
               <w:rPr>
+                <w:rFonts w:ascii="宋体" w:eastAsia="宋体" w:hAnsi="宋体" w:cs="宋体" w:hint="eastAsia"/>
+                <w:sz w:val="24"/>
+                <w:szCs w:val="24"/>
+              </w:rPr>
+            </w:pPr>
+            <w:r>
+              <w:rPr>
+                <w:rFonts w:ascii="宋体" w:eastAsia="宋体" w:hAnsi="宋体" w:cs="宋体" w:hint="eastAsia"/>
+                <w:sz w:val="24"/>
+                <w:szCs w:val="24"/>
+              </w:rPr>
+              <w:t>一、实验项目名称</w:t>
+            </w:r>
+          </w:p>
+          <w:p>
+            <w:pPr>
+              <w:spacing w:line="276" w:lineRule="auto"/>
+              <w:ind w:right="1123"/>
+              <w:rPr>
+                <w:rFonts w:ascii="宋体" w:eastAsia="宋体" w:hAnsi="宋体" w:cs="宋体" w:hint="eastAsia"/>
+                <w:sz w:val="24"/>
+                <w:szCs w:val="24"/>
+              </w:rPr>
+            </w:pPr>
+            <w:bookmarkStart w:id="0" w:name="OLE_LINK31"/>
+            <w:r>
+              <w:rPr>
+                <w:rFonts w:ascii="宋体" w:eastAsia="宋体" w:hAnsi="宋体" w:cs="宋体" w:hint="eastAsia"/>
+                <w:sz w:val="24"/>
+                <w:szCs w:val="24"/>
+              </w:rPr>
+              <w:t>组合数据类型-列表、元组、集合和字典</w:t>
+            </w:r>
+            <w:bookmarkEnd w:id="0"/>
+          </w:p>
+          <w:p>
+            <w:pPr>
+              <w:spacing w:line="276" w:lineRule="auto"/>
+              <w:ind w:right="1123"/>
+              <w:rPr>
+                <w:rFonts w:ascii="宋体" w:hAnsi="宋体" w:cs="等线" w:hint="eastAsia"/>
+                <w:szCs w:val="21"/>
+              </w:rPr>
+            </w:pPr>
+          </w:p>
+          <w:p>
+            <w:pPr>
+              <w:spacing w:line="276" w:lineRule="auto"/>
+              <w:ind w:right="1123"/>
+              <w:rPr>
+                <w:rFonts w:ascii="宋体" w:eastAsia="宋体" w:hAnsi="宋体" w:cs="宋体" w:hint="eastAsia"/>
+                <w:sz w:val="24"/>
+                <w:szCs w:val="24"/>
+              </w:rPr>
+            </w:pPr>
+            <w:r>
+              <w:rPr>
+                <w:rFonts w:ascii="宋体" w:eastAsia="宋体" w:hAnsi="宋体" w:cs="宋体" w:hint="eastAsia"/>
+                <w:sz w:val="24"/>
+                <w:szCs w:val="24"/>
+              </w:rPr>
+              <w:t>二、实验目的与要求</w:t>
+            </w:r>
+          </w:p>
+          <w:p>
+            <w:pPr>
+              <w:spacing w:line="276" w:lineRule="auto"/>
+              <w:ind w:right="1123"/>
+              <w:rPr>
+                <w:rFonts w:ascii="宋体" w:eastAsia="宋体" w:hAnsi="宋体" w:cs="宋体" w:hint="eastAsia"/>
+                <w:sz w:val="24"/>
+                <w:szCs w:val="24"/>
+              </w:rPr>
+            </w:pPr>
+            <w:r>
+              <w:rPr>
+                <w:rFonts w:ascii="宋体" w:eastAsia="宋体" w:hAnsi="宋体" w:cs="宋体" w:hint="eastAsia"/>
+                <w:sz w:val="24"/>
+                <w:szCs w:val="24"/>
+              </w:rPr>
+              <w:t>1、了解组合数据类型，能够说出序列类型、集合类型和映射类型各自的特点</w:t>
+            </w:r>
+          </w:p>
+          <w:p>
+            <w:pPr>
+              <w:spacing w:line="276" w:lineRule="auto"/>
+              <w:ind w:right="1123"/>
+              <w:rPr>
+                <w:rFonts w:ascii="宋体" w:eastAsia="宋体" w:hAnsi="宋体" w:cs="宋体" w:hint="eastAsia"/>
+                <w:sz w:val="24"/>
+                <w:szCs w:val="24"/>
+              </w:rPr>
+            </w:pPr>
+            <w:r>
+              <w:rPr>
+                <w:rFonts w:ascii="宋体" w:eastAsia="宋体" w:hAnsi="宋体" w:cs="宋体" w:hint="eastAsia"/>
+                <w:sz w:val="24"/>
+                <w:szCs w:val="24"/>
+              </w:rPr>
+              <w:t>2、掌握列表的操作，能够独立创建列表并操作列表的元素</w:t>
+            </w:r>
+          </w:p>
+          <w:p>
+            <w:pPr>
+              <w:spacing w:line="276" w:lineRule="auto"/>
+              <w:ind w:right="1123"/>
+              <w:rPr>
+                <w:rFonts w:ascii="宋体" w:eastAsia="宋体" w:hAnsi="宋体" w:cs="宋体" w:hint="eastAsia"/>
+                <w:sz w:val="24"/>
+                <w:szCs w:val="24"/>
+              </w:rPr>
+            </w:pPr>
+            <w:r>
+              <w:rPr>
+                <w:rFonts w:ascii="宋体" w:eastAsia="宋体" w:hAnsi="宋体" w:cs="宋体" w:hint="eastAsia"/>
+                <w:sz w:val="24"/>
+                <w:szCs w:val="24"/>
+              </w:rPr>
+              <w:t>3、掌握列表推导式，能够通过列表推导</w:t>
+            </w:r>
+            <w:proofErr w:type="gramStart"/>
+            <w:r>
+              <w:rPr>
+                <w:rFonts w:ascii="宋体" w:eastAsia="宋体" w:hAnsi="宋体" w:cs="宋体" w:hint="eastAsia"/>
+                <w:sz w:val="24"/>
+                <w:szCs w:val="24"/>
+              </w:rPr>
+              <w:t>式创建</w:t>
+            </w:r>
+            <w:proofErr w:type="gramEnd"/>
+            <w:r>
+              <w:rPr>
+                <w:rFonts w:ascii="宋体" w:eastAsia="宋体" w:hAnsi="宋体" w:cs="宋体" w:hint="eastAsia"/>
+                <w:sz w:val="24"/>
+                <w:szCs w:val="24"/>
+              </w:rPr>
+              <w:t>列表</w:t>
+            </w:r>
+          </w:p>
+          <w:p>
+            <w:pPr>
+              <w:spacing w:line="276" w:lineRule="auto"/>
+              <w:ind w:right="1123"/>
+              <w:rPr>
+                <w:rFonts w:ascii="宋体" w:eastAsia="宋体" w:hAnsi="宋体" w:cs="宋体" w:hint="eastAsia"/>
+                <w:sz w:val="24"/>
+                <w:szCs w:val="24"/>
+              </w:rPr>
+            </w:pPr>
+            <w:r>
+              <w:rPr>
+                <w:rFonts w:ascii="宋体" w:eastAsia="宋体" w:hAnsi="宋体" w:cs="宋体" w:hint="eastAsia"/>
+                <w:sz w:val="24"/>
+                <w:szCs w:val="24"/>
+              </w:rPr>
+              <w:t>4、掌握元组的操作，能够独立创建元组并访问元组的元素</w:t>
+            </w:r>
+          </w:p>
+          <w:p>
+            <w:pPr>
+              <w:spacing w:line="276" w:lineRule="auto"/>
+              <w:ind w:right="1123"/>
+              <w:rPr>
+                <w:rFonts w:ascii="宋体" w:eastAsia="宋体" w:hAnsi="宋体" w:cs="宋体" w:hint="eastAsia"/>
+                <w:sz w:val="24"/>
+                <w:szCs w:val="24"/>
+              </w:rPr>
+            </w:pPr>
+            <w:r>
+              <w:rPr>
+                <w:rFonts w:ascii="宋体" w:eastAsia="宋体" w:hAnsi="宋体" w:cs="宋体" w:hint="eastAsia"/>
+                <w:sz w:val="24"/>
+                <w:szCs w:val="24"/>
+              </w:rPr>
+              <w:t>5、熟悉集合的操作，能够熟练地创建集合并操作集合的元素</w:t>
+            </w:r>
+          </w:p>
+          <w:p>
+            <w:pPr>
+              <w:spacing w:line="276" w:lineRule="auto"/>
+              <w:ind w:right="1123"/>
+              <w:rPr>
+                <w:rFonts w:ascii="宋体" w:eastAsia="宋体" w:hAnsi="宋体" w:cs="宋体" w:hint="eastAsia"/>
+                <w:sz w:val="24"/>
+                <w:szCs w:val="24"/>
+              </w:rPr>
+            </w:pPr>
+            <w:r>
+              <w:rPr>
+                <w:rFonts w:ascii="宋体" w:eastAsia="宋体" w:hAnsi="宋体" w:cs="宋体" w:hint="eastAsia"/>
+                <w:sz w:val="24"/>
+                <w:szCs w:val="24"/>
+              </w:rPr>
+              <w:t>6、掌握字典的操作，能够独立创建字典并操作字典的元素</w:t>
+            </w:r>
+          </w:p>
+          <w:p>
+            <w:pPr>
+              <w:spacing w:line="276" w:lineRule="auto"/>
+              <w:ind w:right="1123"/>
+              <w:rPr>
+                <w:rFonts w:ascii="宋体" w:eastAsia="宋体" w:hAnsi="宋体" w:cs="宋体" w:hint="eastAsia"/>
+                <w:sz w:val="24"/>
+                <w:szCs w:val="24"/>
+              </w:rPr>
+            </w:pPr>
+            <w:r>
+              <w:rPr>
+                <w:rFonts w:ascii="宋体" w:eastAsia="宋体" w:hAnsi="宋体" w:cs="宋体" w:hint="eastAsia"/>
+                <w:sz w:val="24"/>
+                <w:szCs w:val="24"/>
+              </w:rPr>
+              <w:t>7、掌握字典推导式，能够通过字典推导</w:t>
+            </w:r>
+            <w:proofErr w:type="gramStart"/>
+            <w:r>
+              <w:rPr>
+                <w:rFonts w:ascii="宋体" w:eastAsia="宋体" w:hAnsi="宋体" w:cs="宋体" w:hint="eastAsia"/>
+                <w:sz w:val="24"/>
+                <w:szCs w:val="24"/>
+              </w:rPr>
+              <w:t>式创建</w:t>
+            </w:r>
+            <w:proofErr w:type="gramEnd"/>
+            <w:r>
+              <w:rPr>
+                <w:rFonts w:ascii="宋体" w:eastAsia="宋体" w:hAnsi="宋体" w:cs="宋体" w:hint="eastAsia"/>
+                <w:sz w:val="24"/>
+                <w:szCs w:val="24"/>
+              </w:rPr>
+              <w:t>字典</w:t>
+            </w:r>
+          </w:p>
+          <w:p>
+            <w:pPr>
+              <w:spacing w:line="276" w:lineRule="auto"/>
+              <w:ind w:right="1123"/>
+              <w:rPr>
+                <w:rFonts w:ascii="宋体" w:eastAsia="宋体" w:hAnsi="宋体" w:cs="宋体" w:hint="eastAsia"/>
+                <w:sz w:val="24"/>
+                <w:szCs w:val="24"/>
+              </w:rPr>
+            </w:pPr>
+            <w:r>
+              <w:rPr>
+                <w:rFonts w:ascii="宋体" w:eastAsia="宋体" w:hAnsi="宋体" w:cs="宋体" w:hint="eastAsia"/>
+                <w:sz w:val="24"/>
+                <w:szCs w:val="24"/>
+              </w:rPr>
+              <w:t>8、掌握运算符在组合数据类型中的应用，能够通过+、*、in、not in这几个运算符对组合数据类型进行操作</w:t>
+            </w:r>
+          </w:p>
+          <w:p>
+            <w:pPr>
+              <w:spacing w:line="276" w:lineRule="auto"/>
+              <w:ind w:right="1123"/>
+              <w:rPr>
+                <w:rFonts w:ascii="宋体" w:eastAsia="宋体" w:hAnsi="宋体" w:cs="宋体" w:hint="eastAsia"/>
+                <w:sz w:val="24"/>
+                <w:szCs w:val="24"/>
+              </w:rPr>
+            </w:pPr>
+          </w:p>
+          <w:p>
+            <w:pPr>
+              <w:spacing w:line="276" w:lineRule="auto"/>
+              <w:ind w:right="1123"/>
+              <w:rPr>
                 <w:rFonts w:ascii="宋体" w:eastAsia="宋体" w:hAnsi="宋体" w:cs="宋体"/>
                 <w:sz w:val="24"/>
                 <w:szCs w:val="24"/>
@@ -559,8 +827,49 @@
                 <w:sz w:val="24"/>
                 <w:szCs w:val="24"/>
               </w:rPr>
-              <w:t>一、实验项目名称</w:t>
-            </w:r>
+              <w:t>三、实验环境</w:t>
+            </w:r>
+          </w:p>
+          <w:p>
+            <w:pPr>
+              <w:spacing w:line="276" w:lineRule="auto"/>
+              <w:ind w:right="1123"/>
+              <w:rPr>
+                <w:rFonts w:ascii="宋体" w:eastAsia="宋体" w:hAnsi="宋体" w:cs="宋体" w:hint="eastAsia"/>
+                <w:sz w:val="24"/>
+                <w:szCs w:val="24"/>
+              </w:rPr>
+            </w:pPr>
+          </w:p>
+          <w:p>
+            <w:pPr>
+              <w:spacing w:line="276" w:lineRule="auto"/>
+              <w:ind w:right="1123"/>
+              <w:rPr>
+                <w:rFonts w:ascii="宋体" w:eastAsia="宋体" w:hAnsi="宋体" w:cs="宋体" w:hint="eastAsia"/>
+                <w:sz w:val="24"/>
+                <w:szCs w:val="24"/>
+              </w:rPr>
+            </w:pPr>
+            <w:r>
+              <w:rPr>
+                <w:rFonts w:ascii="宋体" w:eastAsia="宋体" w:hAnsi="宋体" w:cs="宋体" w:hint="eastAsia"/>
+                <w:sz w:val="24"/>
+                <w:szCs w:val="24"/>
+              </w:rPr>
+              <w:t>开发环境：Python3.12.1及其以上版本</w:t>
+            </w:r>
+          </w:p>
+          <w:p>
+            <w:pPr>
+              <w:spacing w:line="276" w:lineRule="auto"/>
+              <w:ind w:right="1123"/>
+              <w:rPr>
+                <w:rFonts w:ascii="宋体" w:eastAsia="宋体" w:hAnsi="宋体" w:cs="宋体" w:hint="eastAsia"/>
+                <w:sz w:val="24"/>
+                <w:szCs w:val="24"/>
+              </w:rPr>
+            </w:pPr>
           </w:p>
           <w:p>
             <w:pPr>
@@ -572,304 +881,6 @@
                 <w:szCs w:val="24"/>
               </w:rPr>
             </w:pPr>
-            <w:bookmarkStart w:id="0" w:name="OLE_LINK31"/>
-            <w:r>
-              <w:rPr>
-                <w:rFonts w:ascii="宋体" w:eastAsia="宋体" w:hAnsi="宋体" w:cs="宋体" w:hint="eastAsia"/>
-                <w:sz w:val="24"/>
-                <w:szCs w:val="24"/>
-              </w:rPr>
-              <w:t>组合数据类型-列表、元组、集合和字典</w:t>
-            </w:r>
-            <w:bookmarkEnd w:id="0"/>
-          </w:p>
-          <w:p>
-            <w:pPr>
-              <w:spacing w:line="276" w:lineRule="auto"/>
-              <w:ind w:right="1123"/>
-              <w:rPr>
-                <w:rFonts w:ascii="宋体" w:hAnsi="宋体" w:cs="等线"/>
-                <w:szCs w:val="21"/>
-              </w:rPr>
-            </w:pPr>
-          </w:p>
-          <w:p>
-            <w:pPr>
-              <w:spacing w:line="276" w:lineRule="auto"/>
-              <w:ind w:right="1123"/>
-              <w:rPr>
-                <w:rFonts w:ascii="宋体" w:eastAsia="宋体" w:hAnsi="宋体" w:cs="宋体"/>
-                <w:sz w:val="24"/>
-                <w:szCs w:val="24"/>
-              </w:rPr>
-            </w:pPr>
-            <w:r>
-              <w:rPr>
-                <w:rFonts w:ascii="宋体" w:eastAsia="宋体" w:hAnsi="宋体" w:cs="宋体" w:hint="eastAsia"/>
-                <w:sz w:val="24"/>
-                <w:szCs w:val="24"/>
-              </w:rPr>
-              <w:t>二、实验目的与要求</w:t>
-            </w:r>
-          </w:p>
-          <w:p>
-            <w:pPr>
-              <w:spacing w:line="276" w:lineRule="auto"/>
-              <w:ind w:right="1123"/>
-              <w:rPr>
-                <w:rFonts w:ascii="宋体" w:eastAsia="宋体" w:hAnsi="宋体" w:cs="宋体"/>
-                <w:sz w:val="24"/>
-                <w:szCs w:val="24"/>
-              </w:rPr>
-            </w:pPr>
-            <w:r>
-              <w:rPr>
-                <w:rFonts w:ascii="宋体" w:eastAsia="宋体" w:hAnsi="宋体" w:cs="宋体" w:hint="eastAsia"/>
-                <w:sz w:val="24"/>
-                <w:szCs w:val="24"/>
-              </w:rPr>
-              <w:t>1、了解组合数据类型，能够说出序列类型、集合类型和映射类型各自的特点</w:t>
-            </w:r>
-          </w:p>
-          <w:p>
-            <w:pPr>
-              <w:spacing w:line="276" w:lineRule="auto"/>
-              <w:ind w:right="1123"/>
-              <w:rPr>
-                <w:rFonts w:ascii="宋体" w:eastAsia="宋体" w:hAnsi="宋体" w:cs="宋体"/>
-                <w:sz w:val="24"/>
-                <w:szCs w:val="24"/>
-              </w:rPr>
-            </w:pPr>
-            <w:r>
-              <w:rPr>
-                <w:rFonts w:ascii="宋体" w:eastAsia="宋体" w:hAnsi="宋体" w:cs="宋体" w:hint="eastAsia"/>
-                <w:sz w:val="24"/>
-                <w:szCs w:val="24"/>
-              </w:rPr>
-              <w:t>2、掌握列表的操作，能够独立创建列表并操作列表的元素</w:t>
-            </w:r>
-          </w:p>
-          <w:p>
-            <w:pPr>
-              <w:spacing w:line="276" w:lineRule="auto"/>
-              <w:ind w:right="1123"/>
-              <w:rPr>
-                <w:rFonts w:ascii="宋体" w:eastAsia="宋体" w:hAnsi="宋体" w:cs="宋体"/>
-                <w:sz w:val="24"/>
-                <w:szCs w:val="24"/>
-              </w:rPr>
-            </w:pPr>
-            <w:r>
-              <w:rPr>
-                <w:rFonts w:ascii="宋体" w:eastAsia="宋体" w:hAnsi="宋体" w:cs="宋体" w:hint="eastAsia"/>
-                <w:sz w:val="24"/>
-                <w:szCs w:val="24"/>
-              </w:rPr>
-              <w:t>3、掌握列表推导式，能够通过列表推导</w:t>
-            </w:r>
-            <w:proofErr w:type="gramStart"/>
-            <w:r>
-              <w:rPr>
-                <w:rFonts w:ascii="宋体" w:eastAsia="宋体" w:hAnsi="宋体" w:cs="宋体" w:hint="eastAsia"/>
-                <w:sz w:val="24"/>
-                <w:szCs w:val="24"/>
-              </w:rPr>
-              <w:t>式创建</w:t>
-            </w:r>
-            <w:proofErr w:type="gramEnd"/>
-            <w:r>
-              <w:rPr>
-                <w:rFonts w:ascii="宋体" w:eastAsia="宋体" w:hAnsi="宋体" w:cs="宋体" w:hint="eastAsia"/>
-                <w:sz w:val="24"/>
-                <w:szCs w:val="24"/>
-              </w:rPr>
-              <w:t>列表</w:t>
-            </w:r>
-          </w:p>
-          <w:p>
-            <w:pPr>
-              <w:spacing w:line="276" w:lineRule="auto"/>
-              <w:ind w:right="1123"/>
-              <w:rPr>
-                <w:rFonts w:ascii="宋体" w:eastAsia="宋体" w:hAnsi="宋体" w:cs="宋体"/>
-                <w:sz w:val="24"/>
-                <w:szCs w:val="24"/>
-              </w:rPr>
-            </w:pPr>
-            <w:r>
-              <w:rPr>
-                <w:rFonts w:ascii="宋体" w:eastAsia="宋体" w:hAnsi="宋体" w:cs="宋体" w:hint="eastAsia"/>
-                <w:sz w:val="24"/>
-                <w:szCs w:val="24"/>
-              </w:rPr>
-              <w:t>4、掌握元组的操作，能够独立创建元组并访问元组的元素</w:t>
-            </w:r>
-          </w:p>
-          <w:p>
-            <w:pPr>
-              <w:spacing w:line="276" w:lineRule="auto"/>
-              <w:ind w:right="1123"/>
-              <w:rPr>
-                <w:rFonts w:ascii="宋体" w:eastAsia="宋体" w:hAnsi="宋体" w:cs="宋体"/>
-                <w:sz w:val="24"/>
-                <w:szCs w:val="24"/>
-              </w:rPr>
-            </w:pPr>
-            <w:r>
-              <w:rPr>
-                <w:rFonts w:ascii="宋体" w:eastAsia="宋体" w:hAnsi="宋体" w:cs="宋体" w:hint="eastAsia"/>
-                <w:sz w:val="24"/>
-                <w:szCs w:val="24"/>
-              </w:rPr>
-              <w:t>5、熟悉集合的操作，能够熟练地创建集合并操作集合的元素</w:t>
-            </w:r>
-          </w:p>
-          <w:p>
-            <w:pPr>
-              <w:spacing w:line="276" w:lineRule="auto"/>
-              <w:ind w:right="1123"/>
-              <w:rPr>
-                <w:rFonts w:ascii="宋体" w:eastAsia="宋体" w:hAnsi="宋体" w:cs="宋体"/>
-                <w:sz w:val="24"/>
-                <w:szCs w:val="24"/>
-              </w:rPr>
-            </w:pPr>
-            <w:r>
-              <w:rPr>
-                <w:rFonts w:ascii="宋体" w:eastAsia="宋体" w:hAnsi="宋体" w:cs="宋体" w:hint="eastAsia"/>
-                <w:sz w:val="24"/>
-                <w:szCs w:val="24"/>
-              </w:rPr>
-              <w:t>6、掌握字典的操作，能够独立创建字典并操作字典的元素</w:t>
-            </w:r>
-          </w:p>
-          <w:p>
-            <w:pPr>
-              <w:spacing w:line="276" w:lineRule="auto"/>
-              <w:ind w:right="1123"/>
-              <w:rPr>
-                <w:rFonts w:ascii="宋体" w:eastAsia="宋体" w:hAnsi="宋体" w:cs="宋体"/>
-                <w:sz w:val="24"/>
-                <w:szCs w:val="24"/>
-              </w:rPr>
-            </w:pPr>
-            <w:r>
-              <w:rPr>
-                <w:rFonts w:ascii="宋体" w:eastAsia="宋体" w:hAnsi="宋体" w:cs="宋体" w:hint="eastAsia"/>
-                <w:sz w:val="24"/>
-                <w:szCs w:val="24"/>
-              </w:rPr>
-              <w:t>7、掌握字典推导式，能够通过字典推导</w:t>
-            </w:r>
-            <w:proofErr w:type="gramStart"/>
-            <w:r>
-              <w:rPr>
-                <w:rFonts w:ascii="宋体" w:eastAsia="宋体" w:hAnsi="宋体" w:cs="宋体" w:hint="eastAsia"/>
-                <w:sz w:val="24"/>
-                <w:szCs w:val="24"/>
-              </w:rPr>
-              <w:t>式创建</w:t>
-            </w:r>
-            <w:proofErr w:type="gramEnd"/>
-            <w:r>
-              <w:rPr>
-                <w:rFonts w:ascii="宋体" w:eastAsia="宋体" w:hAnsi="宋体" w:cs="宋体" w:hint="eastAsia"/>
-                <w:sz w:val="24"/>
-                <w:szCs w:val="24"/>
-              </w:rPr>
-              <w:t>字典</w:t>
-            </w:r>
-          </w:p>
-          <w:p>
-            <w:pPr>
-              <w:spacing w:line="276" w:lineRule="auto"/>
-              <w:ind w:right="1123"/>
-              <w:rPr>
-                <w:rFonts w:ascii="宋体" w:eastAsia="宋体" w:hAnsi="宋体" w:cs="宋体"/>
-                <w:sz w:val="24"/>
-                <w:szCs w:val="24"/>
-              </w:rPr>
-            </w:pPr>
-            <w:r>
-              <w:rPr>
-                <w:rFonts w:ascii="宋体" w:eastAsia="宋体" w:hAnsi="宋体" w:cs="宋体" w:hint="eastAsia"/>
-                <w:sz w:val="24"/>
-                <w:szCs w:val="24"/>
-              </w:rPr>
-              <w:t>8、掌握运算符在组合数据类型中的应用，能够通过+、*、in、not in这几个运算符对组合数据类型进行操作</w:t>
-            </w:r>
-          </w:p>
-          <w:p>
-            <w:pPr>
-              <w:spacing w:line="276" w:lineRule="auto"/>
-              <w:ind w:right="1123"/>
-              <w:rPr>
-                <w:rFonts w:ascii="宋体" w:eastAsia="宋体" w:hAnsi="宋体" w:cs="宋体"/>
-                <w:sz w:val="24"/>
-                <w:szCs w:val="24"/>
-              </w:rPr>
-            </w:pPr>
-          </w:p>
-          <w:p>
-            <w:pPr>
-              <w:spacing w:line="276" w:lineRule="auto"/>
-              <w:ind w:right="1123"/>
-              <w:rPr>
-                <w:rFonts w:ascii="宋体" w:eastAsia="宋体" w:hAnsi="宋体" w:cs="宋体"/>
-                <w:sz w:val="24"/>
-                <w:szCs w:val="24"/>
-              </w:rPr>
-            </w:pPr>
-            <w:r>
-              <w:rPr>
-                <w:rFonts w:ascii="宋体" w:eastAsia="宋体" w:hAnsi="宋体" w:cs="宋体" w:hint="eastAsia"/>
-                <w:sz w:val="24"/>
-                <w:szCs w:val="24"/>
-              </w:rPr>
-              <w:t>三、实验环境</w:t>
-            </w:r>
-          </w:p>
-          <w:p>
-            <w:pPr>
-              <w:spacing w:line="276" w:lineRule="auto"/>
-              <w:ind w:right="1123"/>
-              <w:rPr>
-                <w:rFonts w:ascii="宋体" w:eastAsia="宋体" w:hAnsi="宋体" w:cs="宋体"/>
-                <w:sz w:val="24"/>
-                <w:szCs w:val="24"/>
-              </w:rPr>
-            </w:pPr>
-            <w:r>
-              <w:rPr>
-                <w:rFonts w:ascii="宋体" w:eastAsia="宋体" w:hAnsi="宋体" w:cs="宋体" w:hint="eastAsia"/>
-                <w:sz w:val="24"/>
-                <w:szCs w:val="24"/>
-              </w:rPr>
-              <w:t>开发环境：Python3.12.1及其以上版本</w:t>
-            </w:r>
-          </w:p>
-          <w:p>
-            <w:pPr>
-              <w:spacing w:line="276" w:lineRule="auto"/>
-              <w:ind w:right="1123"/>
-              <w:rPr>
-                <w:rFonts w:ascii="宋体" w:eastAsia="宋体" w:hAnsi="宋体" w:cs="宋体"/>
-                <w:sz w:val="24"/>
-                <w:szCs w:val="24"/>
-              </w:rPr>
-            </w:pPr>
-          </w:p>
-          <w:p>
-            <w:pPr>
-              <w:spacing w:line="276" w:lineRule="auto"/>
-              <w:ind w:right="1123"/>
-              <w:rPr>
-                <w:rFonts w:ascii="宋体" w:eastAsia="宋体" w:hAnsi="宋体" w:cs="宋体"/>
-                <w:sz w:val="24"/>
-                <w:szCs w:val="24"/>
-              </w:rPr>
-            </w:pPr>
             <w:r>
               <w:rPr>
                 <w:rFonts w:ascii="宋体" w:eastAsia="宋体" w:hAnsi="宋体" w:cs="宋体" w:hint="eastAsia"/>
@@ -884,7 +895,18 @@
               <w:spacing w:line="276" w:lineRule="auto"/>
               <w:ind w:right="1123"/>
               <w:rPr>
-                <w:rFonts w:ascii="宋体" w:eastAsia="宋体" w:hAnsi="宋体" w:cs="宋体"/>
+                <w:rFonts w:ascii="宋体" w:eastAsia="宋体" w:hAnsi="宋体" w:cs="宋体" w:hint="eastAsia"/>
+                <w:sz w:val="24"/>
+                <w:szCs w:val="24"/>
+              </w:rPr>
+            </w:pPr>
+          </w:p>
+          <w:p>
+            <w:pPr>
+              <w:spacing w:line="276" w:lineRule="auto"/>
+              <w:ind w:right="1123"/>
+              <w:rPr>
+                <w:rFonts w:ascii="宋体" w:eastAsia="宋体" w:hAnsi="宋体" w:cs="宋体" w:hint="eastAsia"/>
                 <w:sz w:val="24"/>
                 <w:szCs w:val="24"/>
               </w:rPr>
@@ -903,7 +925,7 @@
               <w:spacing w:line="276" w:lineRule="auto"/>
               <w:ind w:right="1123"/>
               <w:rPr>
-                <w:rFonts w:ascii="宋体" w:eastAsia="宋体" w:hAnsi="宋体" w:cs="宋体"/>
+                <w:rFonts w:ascii="宋体" w:eastAsia="宋体" w:hAnsi="宋体" w:cs="宋体" w:hint="eastAsia"/>
                 <w:sz w:val="24"/>
                 <w:szCs w:val="24"/>
               </w:rPr>
@@ -931,6 +953,17 @@
               </w:rPr>
               <w:t>实验步骤</w:t>
             </w:r>
+          </w:p>
+          <w:p>
+            <w:pPr>
+              <w:spacing w:line="276" w:lineRule="auto"/>
+              <w:ind w:right="1123"/>
+              <w:rPr>
+                <w:rFonts w:ascii="宋体" w:eastAsia="宋体" w:hAnsi="宋体" w:cs="宋体" w:hint="eastAsia"/>
+                <w:sz w:val="24"/>
+                <w:szCs w:val="24"/>
+              </w:rPr>
+            </w:pPr>
           </w:p>
           <w:p>
             <w:pPr>
@@ -961,34 +994,35 @@
               <w:spacing w:line="276" w:lineRule="auto"/>
               <w:ind w:right="1123" w:firstLineChars="0"/>
               <w:rPr>
+                <w:rFonts w:ascii="宋体" w:eastAsia="宋体" w:hAnsi="宋体" w:cs="宋体" w:hint="eastAsia"/>
+                <w:sz w:val="24"/>
+                <w:szCs w:val="24"/>
+              </w:rPr>
+            </w:pPr>
+            <w:r>
+              <w:rPr>
+                <w:rFonts w:ascii="宋体" w:eastAsia="宋体" w:hAnsi="宋体" w:cs="宋体" w:hint="eastAsia"/>
+                <w:sz w:val="24"/>
+                <w:szCs w:val="24"/>
+              </w:rPr>
+              <w:t>成语接龙</w:t>
+            </w:r>
+          </w:p>
+          <w:p>
+            <w:pPr>
+              <w:pStyle w:val="ad"/>
+              <w:spacing w:line="276" w:lineRule="auto"/>
+              <w:ind w:left="420" w:right="1123" w:firstLineChars="0" w:firstLine="0"/>
+              <w:rPr>
+                <w:rFonts w:ascii="宋体" w:eastAsia="宋体" w:hAnsi="宋体" w:cs="宋体" w:hint="eastAsia"/>
+                <w:sz w:val="24"/>
+                <w:szCs w:val="24"/>
+              </w:rPr>
+            </w:pPr>
+            <w:r>
+              <w:rPr>
                 <w:rFonts w:ascii="宋体" w:eastAsia="宋体" w:hAnsi="宋体" w:cs="宋体"/>
-                <w:sz w:val="24"/>
-                <w:szCs w:val="24"/>
-              </w:rPr>
-            </w:pPr>
-            <w:r>
-              <w:rPr>
-                <w:rFonts w:ascii="宋体" w:eastAsia="宋体" w:hAnsi="宋体" w:cs="宋体" w:hint="eastAsia"/>
-                <w:sz w:val="24"/>
-                <w:szCs w:val="24"/>
-              </w:rPr>
-              <w:t>成语接龙</w:t>
-            </w:r>
-          </w:p>
-          <w:p>
-            <w:pPr>
-              <w:pStyle w:val="ad"/>
-              <w:spacing w:line="276" w:lineRule="auto"/>
-              <w:ind w:left="420" w:right="1123" w:firstLineChars="0" w:firstLine="0"/>
-              <w:rPr>
-                <w:rFonts w:ascii="宋体" w:eastAsia="宋体" w:hAnsi="宋体" w:cs="宋体" w:hint="eastAsia"/>
-                <w:sz w:val="24"/>
-                <w:szCs w:val="24"/>
-              </w:rPr>
-            </w:pPr>
-            <w:r>
-              <w:rPr>
-                <w:rFonts w:ascii="宋体" w:eastAsia="宋体" w:hAnsi="宋体" w:cs="宋体"/>
+                <w:noProof/>
                 <w:sz w:val="24"/>
                 <w:szCs w:val="24"/>
               </w:rPr>
@@ -1029,8 +1063,6 @@
                 </wp:inline>
               </w:drawing>
             </w:r>
-            <w:bookmarkStart w:id="1" w:name="_GoBack"/>
-            <w:bookmarkEnd w:id="1"/>
           </w:p>
           <w:p>
             <w:pPr>
@@ -1042,18 +1074,73 @@
               <w:spacing w:line="276" w:lineRule="auto"/>
               <w:ind w:right="1123" w:firstLineChars="0"/>
               <w:rPr>
+                <w:rFonts w:ascii="宋体" w:eastAsia="宋体" w:hAnsi="宋体" w:cs="宋体" w:hint="eastAsia"/>
+                <w:sz w:val="24"/>
+                <w:szCs w:val="24"/>
+              </w:rPr>
+            </w:pPr>
+            <w:r>
+              <w:rPr>
+                <w:rFonts w:ascii="宋体" w:eastAsia="宋体" w:hAnsi="宋体" w:cs="宋体" w:hint="eastAsia"/>
+                <w:sz w:val="24"/>
+                <w:szCs w:val="24"/>
+              </w:rPr>
+              <w:t>中文数字对照表</w:t>
+            </w:r>
+          </w:p>
+          <w:p>
+            <w:pPr>
+              <w:pStyle w:val="ad"/>
+              <w:spacing w:line="276" w:lineRule="auto"/>
+              <w:ind w:left="420" w:right="1123" w:firstLineChars="0" w:firstLine="0"/>
+              <w:rPr>
+                <w:rFonts w:ascii="宋体" w:eastAsia="宋体" w:hAnsi="宋体" w:cs="宋体" w:hint="eastAsia"/>
+                <w:sz w:val="24"/>
+                <w:szCs w:val="24"/>
+              </w:rPr>
+            </w:pPr>
+            <w:r>
+              <w:rPr>
                 <w:rFonts w:ascii="宋体" w:eastAsia="宋体" w:hAnsi="宋体" w:cs="宋体"/>
-                <w:sz w:val="24"/>
-                <w:szCs w:val="24"/>
-              </w:rPr>
-            </w:pPr>
-            <w:r>
-              <w:rPr>
-                <w:rFonts w:ascii="宋体" w:eastAsia="宋体" w:hAnsi="宋体" w:cs="宋体" w:hint="eastAsia"/>
-                <w:sz w:val="24"/>
-                <w:szCs w:val="24"/>
-              </w:rPr>
-              <w:t>中文数字对照表</w:t>
+                <w:noProof/>
+                <w:sz w:val="24"/>
+                <w:szCs w:val="24"/>
+              </w:rPr>
+              <w:drawing>
+                <wp:inline distT="0" distB="0" distL="0" distR="0" wp14:anchorId="556F7019" wp14:editId="2F2C5DC1">
+                  <wp:extent cx="5274310" cy="4502150"/>
+                  <wp:effectExtent l="0" t="0" r="2540" b="0"/>
+                  <wp:docPr id="2" name="图片 2"/>
+                  <wp:cNvGraphicFramePr>
+                    <a:graphicFrameLocks xmlns:a="http://schemas.openxmlformats.org/drawingml/2006/main" noChangeAspect="1"/>
+                  </wp:cNvGraphicFramePr>
+                  <a:graphic xmlns:a="http://schemas.openxmlformats.org/drawingml/2006/main">
+                    <a:graphicData uri="http://schemas.openxmlformats.org/drawingml/2006/picture">
+                      <pic:pic xmlns:pic="http://schemas.openxmlformats.org/drawingml/2006/picture">
+                        <pic:nvPicPr>
+                          <pic:cNvPr id="1" name=""/>
+                          <pic:cNvPicPr/>
+                        </pic:nvPicPr>
+                        <pic:blipFill>
+                          <a:blip r:embed="rId9"/>
+                          <a:stretch>
+                            <a:fillRect/>
+                          </a:stretch>
+                        </pic:blipFill>
+                        <pic:spPr>
+                          <a:xfrm>
+                            <a:off x="0" y="0"/>
+                            <a:ext cx="5274310" cy="4502150"/>
+                          </a:xfrm>
+                          <a:prstGeom prst="rect">
+                            <a:avLst/>
+                          </a:prstGeom>
+                        </pic:spPr>
+                      </pic:pic>
+                    </a:graphicData>
+                  </a:graphic>
+                </wp:inline>
+              </w:drawing>
             </w:r>
           </w:p>
           <w:p>
@@ -1066,18 +1153,86 @@
               <w:spacing w:line="276" w:lineRule="auto"/>
               <w:ind w:right="1123" w:firstLineChars="0"/>
               <w:rPr>
+                <w:rFonts w:ascii="宋体" w:eastAsia="宋体" w:hAnsi="宋体" w:cs="宋体" w:hint="eastAsia"/>
+                <w:sz w:val="24"/>
+                <w:szCs w:val="24"/>
+              </w:rPr>
+            </w:pPr>
+            <w:r>
+              <w:rPr>
+                <w:rFonts w:ascii="宋体" w:eastAsia="宋体" w:hAnsi="宋体" w:cs="宋体" w:hint="eastAsia"/>
+                <w:sz w:val="24"/>
+                <w:szCs w:val="24"/>
+              </w:rPr>
+              <w:t>词频统计</w:t>
+            </w:r>
+          </w:p>
+          <w:p>
+            <w:pPr>
+              <w:pStyle w:val="ad"/>
+              <w:spacing w:line="276" w:lineRule="auto"/>
+              <w:ind w:left="420" w:right="1123" w:firstLineChars="0" w:firstLine="0"/>
+              <w:rPr>
+                <w:rFonts w:ascii="宋体" w:eastAsia="宋体" w:hAnsi="宋体" w:cs="宋体" w:hint="eastAsia"/>
+                <w:sz w:val="24"/>
+                <w:szCs w:val="24"/>
+              </w:rPr>
+            </w:pPr>
+          </w:p>
+          <w:p>
+            <w:pPr>
+              <w:pStyle w:val="ad"/>
+              <w:spacing w:line="276" w:lineRule="auto"/>
+              <w:ind w:left="420" w:right="1123" w:firstLineChars="0" w:firstLine="0"/>
+              <w:rPr>
+                <w:rFonts w:ascii="宋体" w:eastAsia="宋体" w:hAnsi="宋体" w:cs="宋体" w:hint="eastAsia"/>
+                <w:sz w:val="24"/>
+                <w:szCs w:val="24"/>
+              </w:rPr>
+            </w:pPr>
+            <w:r>
+              <w:rPr>
                 <w:rFonts w:ascii="宋体" w:eastAsia="宋体" w:hAnsi="宋体" w:cs="宋体"/>
-                <w:sz w:val="24"/>
-                <w:szCs w:val="24"/>
-              </w:rPr>
-            </w:pPr>
-            <w:r>
-              <w:rPr>
-                <w:rFonts w:ascii="宋体" w:eastAsia="宋体" w:hAnsi="宋体" w:cs="宋体" w:hint="eastAsia"/>
-                <w:sz w:val="24"/>
-                <w:szCs w:val="24"/>
-              </w:rPr>
-              <w:t>词频统计</w:t>
+                <w:noProof/>
+                <w:sz w:val="24"/>
+                <w:szCs w:val="24"/>
+              </w:rPr>
+              <w:lastRenderedPageBreak/>
+              <w:drawing>
+                <wp:inline distT="0" distB="0" distL="0" distR="0" wp14:anchorId="1FE7A4E8" wp14:editId="14AE2217">
+                  <wp:extent cx="5274310" cy="4389120"/>
+                  <wp:effectExtent l="0" t="0" r="2540" b="0"/>
+                  <wp:docPr id="3" name="图片 3"/>
+                  <wp:cNvGraphicFramePr>
+                    <a:graphicFrameLocks xmlns:a="http://schemas.openxmlformats.org/drawingml/2006/main" noChangeAspect="1"/>
+                  </wp:cNvGraphicFramePr>
+                  <a:graphic xmlns:a="http://schemas.openxmlformats.org/drawingml/2006/main">
+                    <a:graphicData uri="http://schemas.openxmlformats.org/drawingml/2006/picture">
+                      <pic:pic xmlns:pic="http://schemas.openxmlformats.org/drawingml/2006/picture">
+                        <pic:nvPicPr>
+                          <pic:cNvPr id="1" name=""/>
+                          <pic:cNvPicPr/>
+                        </pic:nvPicPr>
+                        <pic:blipFill>
+                          <a:blip r:embed="rId10"/>
+                          <a:stretch>
+                            <a:fillRect/>
+                          </a:stretch>
+                        </pic:blipFill>
+                        <pic:spPr>
+                          <a:xfrm>
+                            <a:off x="0" y="0"/>
+                            <a:ext cx="5274310" cy="4389120"/>
+                          </a:xfrm>
+                          <a:prstGeom prst="rect">
+                            <a:avLst/>
+                          </a:prstGeom>
+                        </pic:spPr>
+                      </pic:pic>
+                    </a:graphicData>
+                  </a:graphic>
+                </wp:inline>
+              </w:drawing>
             </w:r>
           </w:p>
           <w:p>
@@ -1090,58 +1245,179 @@
               <w:spacing w:line="276" w:lineRule="auto"/>
               <w:ind w:right="1123" w:firstLineChars="0"/>
               <w:rPr>
+                <w:rFonts w:ascii="宋体" w:eastAsia="宋体" w:hAnsi="宋体" w:cs="宋体" w:hint="eastAsia"/>
+                <w:sz w:val="24"/>
+                <w:szCs w:val="24"/>
+              </w:rPr>
+            </w:pPr>
+            <w:r>
+              <w:rPr>
+                <w:rFonts w:ascii="宋体" w:eastAsia="宋体" w:hAnsi="宋体" w:cs="宋体" w:hint="eastAsia"/>
+                <w:sz w:val="24"/>
+                <w:szCs w:val="24"/>
+              </w:rPr>
+              <w:t>手机通讯录</w:t>
+            </w:r>
+          </w:p>
+          <w:p>
+            <w:pPr>
+              <w:spacing w:line="276" w:lineRule="auto"/>
+              <w:ind w:right="1123"/>
+              <w:rPr>
+                <w:rFonts w:ascii="宋体" w:eastAsia="宋体" w:hAnsi="宋体" w:cs="宋体" w:hint="eastAsia"/>
+                <w:sz w:val="24"/>
+                <w:szCs w:val="24"/>
+              </w:rPr>
+            </w:pPr>
+            <w:r>
+              <w:rPr>
                 <w:rFonts w:ascii="宋体" w:eastAsia="宋体" w:hAnsi="宋体" w:cs="宋体"/>
-                <w:sz w:val="24"/>
-                <w:szCs w:val="24"/>
-              </w:rPr>
-            </w:pPr>
-            <w:r>
-              <w:rPr>
-                <w:rFonts w:ascii="宋体" w:eastAsia="宋体" w:hAnsi="宋体" w:cs="宋体" w:hint="eastAsia"/>
-                <w:sz w:val="24"/>
-                <w:szCs w:val="24"/>
-              </w:rPr>
-              <w:t>手机通讯录</w:t>
-            </w:r>
-          </w:p>
-          <w:p>
-            <w:pPr>
-              <w:spacing w:line="276" w:lineRule="auto"/>
-              <w:ind w:right="1123"/>
+                <w:noProof/>
+                <w:sz w:val="24"/>
+                <w:szCs w:val="24"/>
+              </w:rPr>
+              <w:lastRenderedPageBreak/>
+              <w:drawing>
+                <wp:inline distT="0" distB="0" distL="0" distR="0" wp14:anchorId="25978B08" wp14:editId="41BD678E">
+                  <wp:extent cx="5274310" cy="4039235"/>
+                  <wp:effectExtent l="0" t="0" r="2540" b="0"/>
+                  <wp:docPr id="4" name="图片 4"/>
+                  <wp:cNvGraphicFramePr>
+                    <a:graphicFrameLocks xmlns:a="http://schemas.openxmlformats.org/drawingml/2006/main" noChangeAspect="1"/>
+                  </wp:cNvGraphicFramePr>
+                  <a:graphic xmlns:a="http://schemas.openxmlformats.org/drawingml/2006/main">
+                    <a:graphicData uri="http://schemas.openxmlformats.org/drawingml/2006/picture">
+                      <pic:pic xmlns:pic="http://schemas.openxmlformats.org/drawingml/2006/picture">
+                        <pic:nvPicPr>
+                          <pic:cNvPr id="1" name=""/>
+                          <pic:cNvPicPr/>
+                        </pic:nvPicPr>
+                        <pic:blipFill>
+                          <a:blip r:embed="rId11"/>
+                          <a:stretch>
+                            <a:fillRect/>
+                          </a:stretch>
+                        </pic:blipFill>
+                        <pic:spPr>
+                          <a:xfrm>
+                            <a:off x="0" y="0"/>
+                            <a:ext cx="5274310" cy="4039235"/>
+                          </a:xfrm>
+                          <a:prstGeom prst="rect">
+                            <a:avLst/>
+                          </a:prstGeom>
+                        </pic:spPr>
+                      </pic:pic>
+                    </a:graphicData>
+                  </a:graphic>
+                </wp:inline>
+              </w:drawing>
+            </w:r>
+          </w:p>
+          <w:p>
+            <w:pPr>
+              <w:spacing w:line="276" w:lineRule="auto"/>
+              <w:ind w:right="1123"/>
+              <w:rPr>
+                <w:rFonts w:ascii="宋体" w:eastAsia="宋体" w:hAnsi="宋体" w:cs="宋体" w:hint="eastAsia"/>
+                <w:sz w:val="24"/>
+                <w:szCs w:val="24"/>
+              </w:rPr>
+            </w:pPr>
+            <w:r>
               <w:rPr>
                 <w:rFonts w:ascii="宋体" w:eastAsia="宋体" w:hAnsi="宋体" w:cs="宋体"/>
-                <w:sz w:val="24"/>
-                <w:szCs w:val="24"/>
-              </w:rPr>
-            </w:pPr>
-          </w:p>
-          <w:p>
-            <w:pPr>
-              <w:spacing w:line="276" w:lineRule="auto"/>
-              <w:ind w:right="1123"/>
-              <w:rPr>
-                <w:rFonts w:ascii="宋体" w:eastAsia="宋体" w:hAnsi="宋体" w:cs="宋体"/>
-                <w:sz w:val="24"/>
-                <w:szCs w:val="24"/>
-              </w:rPr>
-            </w:pPr>
-          </w:p>
-          <w:p>
-            <w:pPr>
-              <w:spacing w:line="276" w:lineRule="auto"/>
-              <w:ind w:right="1123"/>
-              <w:rPr>
-                <w:rFonts w:ascii="宋体" w:eastAsia="宋体" w:hAnsi="宋体" w:cs="宋体"/>
-                <w:sz w:val="24"/>
-                <w:szCs w:val="24"/>
-              </w:rPr>
-            </w:pPr>
-            <w:r>
-              <w:rPr>
-                <w:rFonts w:ascii="宋体" w:eastAsia="宋体" w:hAnsi="宋体" w:cs="宋体" w:hint="eastAsia"/>
-                <w:sz w:val="24"/>
-                <w:szCs w:val="24"/>
-              </w:rPr>
+                <w:noProof/>
+                <w:sz w:val="24"/>
+                <w:szCs w:val="24"/>
+              </w:rPr>
+              <w:drawing>
+                <wp:inline distT="0" distB="0" distL="0" distR="0" wp14:anchorId="4B8EFB49" wp14:editId="474AF697">
+                  <wp:extent cx="5274310" cy="3747135"/>
+                  <wp:effectExtent l="0" t="0" r="2540" b="5715"/>
+                  <wp:docPr id="5" name="图片 5"/>
+                  <wp:cNvGraphicFramePr>
+                    <a:graphicFrameLocks xmlns:a="http://schemas.openxmlformats.org/drawingml/2006/main" noChangeAspect="1"/>
+                  </wp:cNvGraphicFramePr>
+                  <a:graphic xmlns:a="http://schemas.openxmlformats.org/drawingml/2006/main">
+                    <a:graphicData uri="http://schemas.openxmlformats.org/drawingml/2006/picture">
+                      <pic:pic xmlns:pic="http://schemas.openxmlformats.org/drawingml/2006/picture">
+                        <pic:nvPicPr>
+                          <pic:cNvPr id="1" name=""/>
+                          <pic:cNvPicPr/>
+                        </pic:nvPicPr>
+                        <pic:blipFill>
+                          <a:blip r:embed="rId12"/>
+                          <a:stretch>
+                            <a:fillRect/>
+                          </a:stretch>
+                        </pic:blipFill>
+                        <pic:spPr>
+                          <a:xfrm>
+                            <a:off x="0" y="0"/>
+                            <a:ext cx="5274310" cy="3747135"/>
+                          </a:xfrm>
+                          <a:prstGeom prst="rect">
+                            <a:avLst/>
+                          </a:prstGeom>
+                        </pic:spPr>
+                      </pic:pic>
+                    </a:graphicData>
+                  </a:graphic>
+                </wp:inline>
+              </w:drawing>
+            </w:r>
+          </w:p>
+          <w:p>
+            <w:pPr>
+              <w:spacing w:line="276" w:lineRule="auto"/>
+              <w:ind w:right="1123"/>
+              <w:rPr>
+                <w:rFonts w:ascii="宋体" w:eastAsia="宋体" w:hAnsi="宋体" w:cs="宋体" w:hint="eastAsia"/>
+                <w:sz w:val="24"/>
+                <w:szCs w:val="24"/>
+              </w:rPr>
+            </w:pPr>
+          </w:p>
+          <w:p>
+            <w:pPr>
+              <w:spacing w:line="276" w:lineRule="auto"/>
+              <w:ind w:right="1123"/>
+              <w:rPr>
+                <w:rFonts w:ascii="宋体" w:eastAsia="宋体" w:hAnsi="宋体" w:cs="宋体" w:hint="eastAsia"/>
+                <w:sz w:val="24"/>
+                <w:szCs w:val="24"/>
+              </w:rPr>
+            </w:pPr>
+          </w:p>
+          <w:p>
+            <w:pPr>
+              <w:spacing w:line="276" w:lineRule="auto"/>
+              <w:ind w:right="1123"/>
+              <w:rPr>
+                <w:rFonts w:ascii="宋体" w:eastAsia="宋体" w:hAnsi="宋体" w:cs="宋体" w:hint="eastAsia"/>
+                <w:sz w:val="24"/>
+                <w:szCs w:val="24"/>
+              </w:rPr>
+            </w:pPr>
+          </w:p>
+          <w:p>
+            <w:pPr>
+              <w:spacing w:line="276" w:lineRule="auto"/>
+              <w:ind w:right="1123"/>
+              <w:rPr>
+                <w:rFonts w:ascii="宋体" w:eastAsia="宋体" w:hAnsi="宋体" w:cs="宋体" w:hint="eastAsia"/>
+                <w:sz w:val="24"/>
+                <w:szCs w:val="24"/>
+              </w:rPr>
+            </w:pPr>
+            <w:r>
+              <w:rPr>
+                <w:rFonts w:ascii="宋体" w:eastAsia="宋体" w:hAnsi="宋体" w:cs="宋体" w:hint="eastAsia"/>
+                <w:sz w:val="24"/>
+                <w:szCs w:val="24"/>
+              </w:rPr>
+              <w:lastRenderedPageBreak/>
               <w:t>六、实验总结</w:t>
             </w:r>
           </w:p>
@@ -1150,11 +1426,233 @@
               <w:spacing w:line="276" w:lineRule="auto"/>
               <w:ind w:right="1123"/>
               <w:rPr>
-                <w:rFonts w:ascii="宋体" w:eastAsia="宋体" w:hAnsi="宋体" w:cs="宋体"/>
-                <w:sz w:val="24"/>
-                <w:szCs w:val="24"/>
-              </w:rPr>
-            </w:pPr>
+                <w:rFonts w:ascii="宋体" w:eastAsia="宋体" w:hAnsi="宋体" w:cs="宋体" w:hint="eastAsia"/>
+                <w:sz w:val="24"/>
+                <w:szCs w:val="24"/>
+              </w:rPr>
+            </w:pPr>
+            <w:r>
+              <w:rPr>
+                <w:rFonts w:ascii="宋体" w:eastAsia="宋体" w:hAnsi="宋体" w:cs="宋体" w:hint="eastAsia"/>
+                <w:sz w:val="24"/>
+                <w:szCs w:val="24"/>
+              </w:rPr>
+              <w:t>答：</w:t>
+            </w:r>
+            <w:r>
+              <w:rPr>
+                <w:rFonts w:ascii="宋体" w:eastAsia="宋体" w:hAnsi="宋体" w:cs="宋体" w:hint="eastAsia"/>
+                <w:sz w:val="24"/>
+                <w:szCs w:val="24"/>
+              </w:rPr>
+              <w:t>通过</w:t>
+            </w:r>
+            <w:r>
+              <w:rPr>
+                <w:rFonts w:ascii="宋体" w:eastAsia="宋体" w:hAnsi="宋体" w:cs="宋体" w:hint="eastAsia"/>
+                <w:sz w:val="24"/>
+                <w:szCs w:val="24"/>
+              </w:rPr>
+              <w:t>本次实验我深入理解并熟练掌握了Python中四大组合数据类型——列表（List）、元组（Tuple）、集合（Set）和字典（Dictionary）的特性与基本操作。</w:t>
+            </w:r>
+          </w:p>
+          <w:p>
+            <w:pPr>
+              <w:spacing w:line="276" w:lineRule="auto"/>
+              <w:ind w:right="1123"/>
+              <w:rPr>
+                <w:rFonts w:ascii="宋体" w:eastAsia="宋体" w:hAnsi="宋体" w:cs="宋体" w:hint="eastAsia"/>
+                <w:sz w:val="24"/>
+                <w:szCs w:val="24"/>
+              </w:rPr>
+            </w:pPr>
+          </w:p>
+          <w:p>
+            <w:pPr>
+              <w:spacing w:line="276" w:lineRule="auto"/>
+              <w:ind w:right="1123"/>
+              <w:rPr>
+                <w:rFonts w:ascii="宋体" w:eastAsia="宋体" w:hAnsi="宋体" w:cs="宋体" w:hint="eastAsia"/>
+                <w:sz w:val="24"/>
+                <w:szCs w:val="24"/>
+              </w:rPr>
+            </w:pPr>
+            <w:r>
+              <w:rPr>
+                <w:rFonts w:ascii="宋体" w:eastAsia="宋体" w:hAnsi="宋体" w:cs="宋体" w:hint="eastAsia"/>
+                <w:sz w:val="24"/>
+                <w:szCs w:val="24"/>
+              </w:rPr>
+              <w:t>在具体的实验任务中，我将理论知识与实际应用相结合：</w:t>
+            </w:r>
+          </w:p>
+          <w:p>
+            <w:pPr>
+              <w:spacing w:line="276" w:lineRule="auto"/>
+              <w:ind w:right="1123"/>
+              <w:rPr>
+                <w:rFonts w:ascii="宋体" w:eastAsia="宋体" w:hAnsi="宋体" w:cs="宋体" w:hint="eastAsia"/>
+                <w:sz w:val="24"/>
+                <w:szCs w:val="24"/>
+              </w:rPr>
+            </w:pPr>
+          </w:p>
+          <w:p>
+            <w:pPr>
+              <w:spacing w:line="276" w:lineRule="auto"/>
+              <w:ind w:right="1123"/>
+              <w:rPr>
+                <w:rFonts w:ascii="宋体" w:eastAsia="宋体" w:hAnsi="宋体" w:cs="宋体" w:hint="eastAsia"/>
+                <w:sz w:val="24"/>
+                <w:szCs w:val="24"/>
+              </w:rPr>
+            </w:pPr>
+            <w:r>
+              <w:rPr>
+                <w:rFonts w:ascii="宋体" w:eastAsia="宋体" w:hAnsi="宋体" w:cs="宋体" w:hint="eastAsia"/>
+                <w:sz w:val="24"/>
+                <w:szCs w:val="24"/>
+              </w:rPr>
+              <w:t>在成语接龙任务中，我利用列表的有序性进行元素的存储与切片提取，并结合循环控制语句实现了前后成语首尾字的匹配。</w:t>
+            </w:r>
+          </w:p>
+          <w:p>
+            <w:pPr>
+              <w:spacing w:line="276" w:lineRule="auto"/>
+              <w:ind w:right="1123"/>
+              <w:rPr>
+                <w:rFonts w:ascii="宋体" w:eastAsia="宋体" w:hAnsi="宋体" w:cs="宋体" w:hint="eastAsia"/>
+                <w:sz w:val="24"/>
+                <w:szCs w:val="24"/>
+              </w:rPr>
+            </w:pPr>
+          </w:p>
+          <w:p>
+            <w:pPr>
+              <w:spacing w:line="276" w:lineRule="auto"/>
+              <w:ind w:right="1123"/>
+              <w:rPr>
+                <w:rFonts w:ascii="宋体" w:eastAsia="宋体" w:hAnsi="宋体" w:cs="宋体" w:hint="eastAsia"/>
+                <w:sz w:val="24"/>
+                <w:szCs w:val="24"/>
+              </w:rPr>
+            </w:pPr>
+            <w:r>
+              <w:rPr>
+                <w:rFonts w:ascii="宋体" w:eastAsia="宋体" w:hAnsi="宋体" w:cs="宋体" w:hint="eastAsia"/>
+                <w:sz w:val="24"/>
+                <w:szCs w:val="24"/>
+              </w:rPr>
+              <w:t>在中文数字对照表任务中，我体会到了元组不可变且查询效率高的特点，结合字符串处理，实现了数字到中文大写的精准映射。在编写该代码时，我发现了浮点数转换会导致末尾的 0 丢失以及遇到小数点报错的问题，后续通过改用字符串分片和分节处理的方法（每4位一节）完美解决了该Bug，提升了自己解决复杂逻辑问题的能力。</w:t>
+            </w:r>
+          </w:p>
+          <w:p>
+            <w:pPr>
+              <w:spacing w:line="276" w:lineRule="auto"/>
+              <w:ind w:right="1123"/>
+              <w:rPr>
+                <w:rFonts w:ascii="宋体" w:eastAsia="宋体" w:hAnsi="宋体" w:cs="宋体" w:hint="eastAsia"/>
+                <w:sz w:val="24"/>
+                <w:szCs w:val="24"/>
+              </w:rPr>
+            </w:pPr>
+          </w:p>
+          <w:p>
+            <w:pPr>
+              <w:spacing w:line="276" w:lineRule="auto"/>
+              <w:ind w:right="1123"/>
+              <w:rPr>
+                <w:rFonts w:ascii="宋体" w:eastAsia="宋体" w:hAnsi="宋体" w:cs="宋体" w:hint="eastAsia"/>
+                <w:sz w:val="24"/>
+                <w:szCs w:val="24"/>
+              </w:rPr>
+            </w:pPr>
+            <w:r>
+              <w:rPr>
+                <w:rFonts w:ascii="宋体" w:eastAsia="宋体" w:hAnsi="宋体" w:cs="宋体" w:hint="eastAsia"/>
+                <w:sz w:val="24"/>
+                <w:szCs w:val="24"/>
+              </w:rPr>
+              <w:t xml:space="preserve">在词频统计和手机通讯录任务中，我充分利用了字典（映射类型）的键值对（Key-Value）结构。特别是在词频统计中，学会了使用 </w:t>
+            </w:r>
+            <w:proofErr w:type="spellStart"/>
+            <w:r>
+              <w:rPr>
+                <w:rFonts w:ascii="宋体" w:eastAsia="宋体" w:hAnsi="宋体" w:cs="宋体" w:hint="eastAsia"/>
+                <w:sz w:val="24"/>
+                <w:szCs w:val="24"/>
+              </w:rPr>
+              <w:t>dict.get</w:t>
+            </w:r>
+            <w:proofErr w:type="spellEnd"/>
+            <w:r>
+              <w:rPr>
+                <w:rFonts w:ascii="宋体" w:eastAsia="宋体" w:hAnsi="宋体" w:cs="宋体" w:hint="eastAsia"/>
+                <w:sz w:val="24"/>
+                <w:szCs w:val="24"/>
+              </w:rPr>
+              <w:t>(key, default) 方法来避免键不存在时的报错；在通讯录任务中，熟练掌握了字典元素的增加、删除、修改和查询操作。</w:t>
+            </w:r>
+          </w:p>
+          <w:p>
+            <w:pPr>
+              <w:spacing w:line="276" w:lineRule="auto"/>
+              <w:ind w:right="1123"/>
+              <w:rPr>
+                <w:rFonts w:ascii="宋体" w:eastAsia="宋体" w:hAnsi="宋体" w:cs="宋体" w:hint="eastAsia"/>
+                <w:sz w:val="24"/>
+                <w:szCs w:val="24"/>
+              </w:rPr>
+            </w:pPr>
+          </w:p>
+          <w:p>
+            <w:pPr>
+              <w:spacing w:line="276" w:lineRule="auto"/>
+              <w:ind w:right="1123"/>
+              <w:rPr>
+                <w:rFonts w:ascii="宋体" w:eastAsia="宋体" w:hAnsi="宋体" w:cs="宋体" w:hint="eastAsia"/>
+                <w:sz w:val="24"/>
+                <w:szCs w:val="24"/>
+              </w:rPr>
+            </w:pPr>
+            <w:r>
+              <w:rPr>
+                <w:rFonts w:ascii="宋体" w:eastAsia="宋体" w:hAnsi="宋体" w:cs="宋体" w:hint="eastAsia"/>
+                <w:sz w:val="24"/>
+                <w:szCs w:val="24"/>
+              </w:rPr>
+              <w:t>此外，通过本次实验，我也深刻体会到了选择合适的数据结构对提升代码效率的重要性。例如，在处理需要去重的数据时，使用集合的特性比使用列表循环判断要高效得多；而在需要快速查找对应关系时，字典的哈希查找则是最佳选择。</w:t>
+            </w:r>
+          </w:p>
+          <w:p>
+            <w:pPr>
+              <w:spacing w:line="276" w:lineRule="auto"/>
+              <w:ind w:right="1123"/>
+              <w:rPr>
+                <w:rFonts w:ascii="宋体" w:eastAsia="宋体" w:hAnsi="宋体" w:cs="宋体" w:hint="eastAsia"/>
+                <w:sz w:val="24"/>
+                <w:szCs w:val="24"/>
+              </w:rPr>
+            </w:pPr>
+          </w:p>
+          <w:p>
+            <w:pPr>
+              <w:spacing w:line="276" w:lineRule="auto"/>
+              <w:ind w:right="1123"/>
+              <w:rPr>
+                <w:rFonts w:ascii="宋体" w:eastAsia="宋体" w:hAnsi="宋体" w:cs="宋体" w:hint="eastAsia"/>
+                <w:sz w:val="24"/>
+                <w:szCs w:val="24"/>
+              </w:rPr>
+            </w:pPr>
+            <w:r>
+              <w:rPr>
+                <w:rFonts w:ascii="宋体" w:eastAsia="宋体" w:hAnsi="宋体" w:cs="宋体" w:hint="eastAsia"/>
+                <w:sz w:val="24"/>
+                <w:szCs w:val="24"/>
+              </w:rPr>
+              <w:t>在实验过程中，我也遇到了如缩进错误、循环条件设置不当等基础问题，通过单步调试和查阅官方文档，我都逐一克服了。这些基础技能将成为后续Python学习的必要支撑，我将在此基础上继续深入学习和实践，探索更高级的数据处理和面向对象编程技术。</w:t>
+            </w:r>
           </w:p>
           <w:p>
             <w:pPr>
@@ -1211,7 +1709,7 @@
       </w:pPr>
     </w:p>
     <w:sectPr>
-      <w:footerReference w:type="default" r:id="rId9"/>
+      <w:footerReference w:type="default" r:id="rId13"/>
       <w:pgSz w:w="11906" w:h="16838"/>
       <w:pgMar w:top="1440" w:right="1800" w:bottom="1440" w:left="1800" w:header="851" w:footer="992" w:gutter="0"/>
       <w:pgNumType w:start="1"/>
@@ -1223,9 +1721,14 @@
 </file>
 
 <file path=word/endnotes.xml><?xml version="1.0" encoding="utf-8"?>
-<w:endnotes xmlns:wpc="http://schemas.microsoft.com/office/word/2010/wordprocessingCanvas" xmlns:cx="http://schemas.microsoft.com/office/drawing/2014/chartex" xmlns:mc="http://schemas.openxmlformats.org/markup-compatibility/2006" xmlns:o="urn:schemas-microsoft-com:office:office" xmlns:r="http://schemas.openxmlformats.org/officeDocument/2006/relationships" xmlns:m="http://schemas.openxmlformats.org/officeDocument/2006/math" xmlns:v="urn:schemas-microsoft-com:vml" xmlns:wp14="http://schemas.microsoft.com/office/word/2010/wordprocessingDrawing" xmlns:wp="http://schemas.openxmlformats.org/drawingml/2006/wordprocessingDrawing" xmlns:w10="urn:schemas-microsoft-com:office:word" xmlns:w="http://schemas.openxmlformats.org/wordprocessingml/2006/main" xmlns:w14="http://schemas.microsoft.com/office/word/2010/wordml" xmlns:w15="http://schemas.microsoft.com/office/word/2012/wordml" xmlns:w16se="http://schemas.microsoft.com/office/word/2015/wordml/symex" xmlns:wpg="http://schemas.microsoft.com/office/word/2010/wordprocessingGroup" xmlns:wpi="http://schemas.microsoft.com/office/word/2010/wordprocessingInk" xmlns:wne="http://schemas.microsoft.com/office/word/2006/wordml" xmlns:wps="http://schemas.microsoft.com/office/word/2010/wordprocessingShape" mc:Ignorable="w14 w15 w16se wp14">
+<w:endnotes xmlns:wpc="http://schemas.microsoft.com/office/word/2010/wordprocessingCanvas" xmlns:cx="http://schemas.microsoft.com/office/drawing/2014/chartex" xmlns:cx1="http://schemas.microsoft.com/office/drawing/2015/9/8/chartex" xmlns:cx2="http://schemas.microsoft.com/office/drawing/2015/10/21/chartex" xmlns:cx3="http://schemas.microsoft.com/office/drawing/2016/5/9/chartex" xmlns:cx4="http://schemas.microsoft.com/office/drawing/2016/5/10/chartex" xmlns:cx5="http://schemas.microsoft.com/office/drawing/2016/5/11/chartex" xmlns:cx6="http://schemas.microsoft.com/office/drawing/2016/5/12/chartex" xmlns:cx7="http://schemas.microsoft.com/office/drawing/2016/5/13/chartex" xmlns:cx8="http://schemas.microsoft.com/office/drawing/2016/5/14/chartex" xmlns:mc="http://schemas.openxmlformats.org/markup-compatibility/2006" xmlns:aink="http://schemas.microsoft.com/office/drawing/2016/ink" xmlns:am3d="http://schemas.microsoft.com/office/drawing/2017/model3d" xmlns:o="urn:schemas-microsoft-com:office:office" xmlns:oel="http://schemas.microsoft.com/office/2019/extlst" xmlns:r="http://schemas.openxmlformats.org/officeDocument/2006/relationships" xmlns:m="http://schemas.openxmlformats.org/officeDocument/2006/math" xmlns:v="urn:schemas-microsoft-com:vml" xmlns:wp14="http://schemas.microsoft.com/office/word/2010/wordprocessingDrawing" xmlns:wp="http://schemas.openxmlformats.org/drawingml/2006/wordprocessingDrawing" xmlns:w10="urn:schemas-microsoft-com:office:word" xmlns:w="http://schemas.openxmlformats.org/wordprocessingml/2006/main" xmlns:w14="http://schemas.microsoft.com/office/word/2010/wordml" xmlns:w15="http://schemas.microsoft.com/office/word/2012/wordml" xmlns:w16cex="http://schemas.microsoft.com/office/word/2018/wordml/cex" xmlns:w16cid="http://schemas.microsoft.com/office/word/2016/wordml/cid" xmlns:w16="http://schemas.microsoft.com/office/word/2018/wordml" xmlns:w16sdtdh="http://schemas.microsoft.com/office/word/2020/wordml/sdtdatahash" xmlns:w16se="http://schemas.microsoft.com/office/word/2015/wordml/symex" xmlns:wpg="http://schemas.microsoft.com/office/word/2010/wordprocessingGroup" xmlns:wpi="http://schemas.microsoft.com/office/word/2010/wordprocessingInk" xmlns:wne="http://schemas.microsoft.com/office/word/2006/wordml" xmlns:wps="http://schemas.microsoft.com/office/word/2010/wordprocessingShape" mc:Ignorable="w14 w15 w16se w16cid w16 w16cex w16sdtdh wp14">
   <w:endnote w:type="separator" w:id="-1">
     <w:p>
+      <w:pPr>
+        <w:rPr>
+          <w:rFonts w:hint="eastAsia"/>
+        </w:rPr>
+      </w:pPr>
       <w:r>
         <w:separator/>
       </w:r>
@@ -1233,6 +1736,11 @@
   </w:endnote>
   <w:endnote w:type="continuationSeparator" w:id="0">
     <w:p>
+      <w:pPr>
+        <w:rPr>
+          <w:rFonts w:hint="eastAsia"/>
+        </w:rPr>
+      </w:pPr>
       <w:r>
         <w:continuationSeparator/>
       </w:r>
@@ -1242,12 +1750,12 @@
 </file>
 
 <file path=word/footer1.xml><?xml version="1.0" encoding="utf-8"?>
-<w:ftr xmlns:wpc="http://schemas.microsoft.com/office/word/2010/wordprocessingCanvas" xmlns:cx="http://schemas.microsoft.com/office/drawing/2014/chartex" xmlns:mc="http://schemas.openxmlformats.org/markup-compatibility/2006" xmlns:o="urn:schemas-microsoft-com:office:office" xmlns:r="http://schemas.openxmlformats.org/officeDocument/2006/relationships" xmlns:m="http://schemas.openxmlformats.org/officeDocument/2006/math" xmlns:v="urn:schemas-microsoft-com:vml" xmlns:wp14="http://schemas.microsoft.com/office/word/2010/wordprocessingDrawing" xmlns:wp="http://schemas.openxmlformats.org/drawingml/2006/wordprocessingDrawing" xmlns:w10="urn:schemas-microsoft-com:office:word" xmlns:w="http://schemas.openxmlformats.org/wordprocessingml/2006/main" xmlns:w14="http://schemas.microsoft.com/office/word/2010/wordml" xmlns:w15="http://schemas.microsoft.com/office/word/2012/wordml" xmlns:w16se="http://schemas.microsoft.com/office/word/2015/wordml/symex" xmlns:wpg="http://schemas.microsoft.com/office/word/2010/wordprocessingGroup" xmlns:wpi="http://schemas.microsoft.com/office/word/2010/wordprocessingInk" xmlns:wne="http://schemas.microsoft.com/office/word/2006/wordml" xmlns:wps="http://schemas.microsoft.com/office/word/2010/wordprocessingShape" mc:Ignorable="w14 w15 w16se wp14">
+<w:ftr xmlns:wpc="http://schemas.microsoft.com/office/word/2010/wordprocessingCanvas" xmlns:cx="http://schemas.microsoft.com/office/drawing/2014/chartex" xmlns:cx1="http://schemas.microsoft.com/office/drawing/2015/9/8/chartex" xmlns:cx2="http://schemas.microsoft.com/office/drawing/2015/10/21/chartex" xmlns:cx3="http://schemas.microsoft.com/office/drawing/2016/5/9/chartex" xmlns:cx4="http://schemas.microsoft.com/office/drawing/2016/5/10/chartex" xmlns:cx5="http://schemas.microsoft.com/office/drawing/2016/5/11/chartex" xmlns:cx6="http://schemas.microsoft.com/office/drawing/2016/5/12/chartex" xmlns:cx7="http://schemas.microsoft.com/office/drawing/2016/5/13/chartex" xmlns:cx8="http://schemas.microsoft.com/office/drawing/2016/5/14/chartex" xmlns:mc="http://schemas.openxmlformats.org/markup-compatibility/2006" xmlns:aink="http://schemas.microsoft.com/office/drawing/2016/ink" xmlns:am3d="http://schemas.microsoft.com/office/drawing/2017/model3d" xmlns:o="urn:schemas-microsoft-com:office:office" xmlns:oel="http://schemas.microsoft.com/office/2019/extlst" xmlns:r="http://schemas.openxmlformats.org/officeDocument/2006/relationships" xmlns:m="http://schemas.openxmlformats.org/officeDocument/2006/math" xmlns:v="urn:schemas-microsoft-com:vml" xmlns:wp14="http://schemas.microsoft.com/office/word/2010/wordprocessingDrawing" xmlns:wp="http://schemas.openxmlformats.org/drawingml/2006/wordprocessingDrawing" xmlns:w10="urn:schemas-microsoft-com:office:word" xmlns:w="http://schemas.openxmlformats.org/wordprocessingml/2006/main" xmlns:w14="http://schemas.microsoft.com/office/word/2010/wordml" xmlns:w15="http://schemas.microsoft.com/office/word/2012/wordml" xmlns:w16cex="http://schemas.microsoft.com/office/word/2018/wordml/cex" xmlns:w16cid="http://schemas.microsoft.com/office/word/2016/wordml/cid" xmlns:w16="http://schemas.microsoft.com/office/word/2018/wordml" xmlns:w16sdtdh="http://schemas.microsoft.com/office/word/2020/wordml/sdtdatahash" xmlns:w16se="http://schemas.microsoft.com/office/word/2015/wordml/symex" xmlns:wpg="http://schemas.microsoft.com/office/word/2010/wordprocessingGroup" xmlns:wpi="http://schemas.microsoft.com/office/word/2010/wordprocessingInk" xmlns:wne="http://schemas.microsoft.com/office/word/2006/wordml" xmlns:wps="http://schemas.microsoft.com/office/word/2010/wordprocessingShape" mc:Ignorable="w14 w15 w16se w16cid w16 w16cex w16sdtdh wp14">
   <w:p>
     <w:pPr>
       <w:pStyle w:val="a7"/>
       <w:rPr>
-        <w:rFonts w:ascii="宋体" w:eastAsia="宋体" w:hAnsi="宋体"/>
+        <w:rFonts w:ascii="宋体" w:eastAsia="宋体" w:hAnsi="宋体" w:hint="eastAsia"/>
         <w:b/>
         <w:sz w:val="28"/>
         <w:szCs w:val="28"/>
@@ -1270,7 +1778,27 @@
         <w:szCs w:val="28"/>
         <w:u w:val="single"/>
       </w:rPr>
-      <w:t xml:space="preserve">    </w:t>
+      <w:t xml:space="preserve">  </w:t>
+    </w:r>
+    <w:r>
+      <w:rPr>
+        <w:rFonts w:ascii="宋体" w:eastAsia="宋体" w:hAnsi="宋体" w:hint="eastAsia"/>
+        <w:b/>
+        <w:sz w:val="28"/>
+        <w:szCs w:val="28"/>
+        <w:u w:val="single"/>
+      </w:rPr>
+      <w:t>5</w:t>
+    </w:r>
+    <w:r>
+      <w:rPr>
+        <w:rFonts w:ascii="宋体" w:eastAsia="宋体" w:hAnsi="宋体"/>
+        <w:b/>
+        <w:sz w:val="28"/>
+        <w:szCs w:val="28"/>
+        <w:u w:val="single"/>
+      </w:rPr>
+      <w:t xml:space="preserve">  </w:t>
     </w:r>
     <w:r>
       <w:rPr>
@@ -1332,15 +1860,23 @@
   <w:p>
     <w:pPr>
       <w:pStyle w:val="a7"/>
+      <w:rPr>
+        <w:rFonts w:hint="eastAsia"/>
+      </w:rPr>
     </w:pPr>
   </w:p>
 </w:ftr>
 </file>
 
 <file path=word/footnotes.xml><?xml version="1.0" encoding="utf-8"?>
-<w:footnotes xmlns:wpc="http://schemas.microsoft.com/office/word/2010/wordprocessingCanvas" xmlns:cx="http://schemas.microsoft.com/office/drawing/2014/chartex" xmlns:mc="http://schemas.openxmlformats.org/markup-compatibility/2006" xmlns:o="urn:schemas-microsoft-com:office:office" xmlns:r="http://schemas.openxmlformats.org/officeDocument/2006/relationships" xmlns:m="http://schemas.openxmlformats.org/officeDocument/2006/math" xmlns:v="urn:schemas-microsoft-com:vml" xmlns:wp14="http://schemas.microsoft.com/office/word/2010/wordprocessingDrawing" xmlns:wp="http://schemas.openxmlformats.org/drawingml/2006/wordprocessingDrawing" xmlns:w10="urn:schemas-microsoft-com:office:word" xmlns:w="http://schemas.openxmlformats.org/wordprocessingml/2006/main" xmlns:w14="http://schemas.microsoft.com/office/word/2010/wordml" xmlns:w15="http://schemas.microsoft.com/office/word/2012/wordml" xmlns:w16se="http://schemas.microsoft.com/office/word/2015/wordml/symex" xmlns:wpg="http://schemas.microsoft.com/office/word/2010/wordprocessingGroup" xmlns:wpi="http://schemas.microsoft.com/office/word/2010/wordprocessingInk" xmlns:wne="http://schemas.microsoft.com/office/word/2006/wordml" xmlns:wps="http://schemas.microsoft.com/office/word/2010/wordprocessingShape" mc:Ignorable="w14 w15 w16se wp14">
+<w:footnotes xmlns:wpc="http://schemas.microsoft.com/office/word/2010/wordprocessingCanvas" xmlns:cx="http://schemas.microsoft.com/office/drawing/2014/chartex" xmlns:cx1="http://schemas.microsoft.com/office/drawing/2015/9/8/chartex" xmlns:cx2="http://schemas.microsoft.com/office/drawing/2015/10/21/chartex" xmlns:cx3="http://schemas.microsoft.com/office/drawing/2016/5/9/chartex" xmlns:cx4="http://schemas.microsoft.com/office/drawing/2016/5/10/chartex" xmlns:cx5="http://schemas.microsoft.com/office/drawing/2016/5/11/chartex" xmlns:cx6="http://schemas.microsoft.com/office/drawing/2016/5/12/chartex" xmlns:cx7="http://schemas.microsoft.com/office/drawing/2016/5/13/chartex" xmlns:cx8="http://schemas.microsoft.com/office/drawing/2016/5/14/chartex" xmlns:mc="http://schemas.openxmlformats.org/markup-compatibility/2006" xmlns:aink="http://schemas.microsoft.com/office/drawing/2016/ink" xmlns:am3d="http://schemas.microsoft.com/office/drawing/2017/model3d" xmlns:o="urn:schemas-microsoft-com:office:office" xmlns:oel="http://schemas.microsoft.com/office/2019/extlst" xmlns:r="http://schemas.openxmlformats.org/officeDocument/2006/relationships" xmlns:m="http://schemas.openxmlformats.org/officeDocument/2006/math" xmlns:v="urn:schemas-microsoft-com:vml" xmlns:wp14="http://schemas.microsoft.com/office/word/2010/wordprocessingDrawing" xmlns:wp="http://schemas.openxmlformats.org/drawingml/2006/wordprocessingDrawing" xmlns:w10="urn:schemas-microsoft-com:office:word" xmlns:w="http://schemas.openxmlformats.org/wordprocessingml/2006/main" xmlns:w14="http://schemas.microsoft.com/office/word/2010/wordml" xmlns:w15="http://schemas.microsoft.com/office/word/2012/wordml" xmlns:w16cex="http://schemas.microsoft.com/office/word/2018/wordml/cex" xmlns:w16cid="http://schemas.microsoft.com/office/word/2016/wordml/cid" xmlns:w16="http://schemas.microsoft.com/office/word/2018/wordml" xmlns:w16sdtdh="http://schemas.microsoft.com/office/word/2020/wordml/sdtdatahash" xmlns:w16se="http://schemas.microsoft.com/office/word/2015/wordml/symex" xmlns:wpg="http://schemas.microsoft.com/office/word/2010/wordprocessingGroup" xmlns:wpi="http://schemas.microsoft.com/office/word/2010/wordprocessingInk" xmlns:wne="http://schemas.microsoft.com/office/word/2006/wordml" xmlns:wps="http://schemas.microsoft.com/office/word/2010/wordprocessingShape" mc:Ignorable="w14 w15 w16se w16cid w16 w16cex w16sdtdh wp14">
   <w:footnote w:type="separator" w:id="-1">
     <w:p>
+      <w:pPr>
+        <w:rPr>
+          <w:rFonts w:hint="eastAsia"/>
+        </w:rPr>
+      </w:pPr>
       <w:r>
         <w:separator/>
       </w:r>
@@ -1348,6 +1884,11 @@
   </w:footnote>
   <w:footnote w:type="continuationSeparator" w:id="0">
     <w:p>
+      <w:pPr>
+        <w:rPr>
+          <w:rFonts w:hint="eastAsia"/>
+        </w:rPr>
+      </w:pPr>
       <w:r>
         <w:continuationSeparator/>
       </w:r>
@@ -1357,7 +1898,7 @@
 </file>
 
 <file path=word/numbering.xml><?xml version="1.0" encoding="utf-8"?>
-<w:numbering xmlns:wpc="http://schemas.microsoft.com/office/word/2010/wordprocessingCanvas" xmlns:cx="http://schemas.microsoft.com/office/drawing/2014/chartex" xmlns:mc="http://schemas.openxmlformats.org/markup-compatibility/2006" xmlns:o="urn:schemas-microsoft-com:office:office" xmlns:r="http://schemas.openxmlformats.org/officeDocument/2006/relationships" xmlns:m="http://schemas.openxmlformats.org/officeDocument/2006/math" xmlns:v="urn:schemas-microsoft-com:vml" xmlns:wp14="http://schemas.microsoft.com/office/word/2010/wordprocessingDrawing" xmlns:wp="http://schemas.openxmlformats.org/drawingml/2006/wordprocessingDrawing" xmlns:w10="urn:schemas-microsoft-com:office:word" xmlns:w="http://schemas.openxmlformats.org/wordprocessingml/2006/main" xmlns:w14="http://schemas.microsoft.com/office/word/2010/wordml" xmlns:w15="http://schemas.microsoft.com/office/word/2012/wordml" xmlns:w16se="http://schemas.microsoft.com/office/word/2015/wordml/symex" xmlns:wpg="http://schemas.microsoft.com/office/word/2010/wordprocessingGroup" xmlns:wpi="http://schemas.microsoft.com/office/word/2010/wordprocessingInk" xmlns:wne="http://schemas.microsoft.com/office/word/2006/wordml" xmlns:wps="http://schemas.microsoft.com/office/word/2010/wordprocessingShape" mc:Ignorable="w14 w15 w16se wp14">
+<w:numbering xmlns:wpc="http://schemas.microsoft.com/office/word/2010/wordprocessingCanvas" xmlns:cx="http://schemas.microsoft.com/office/drawing/2014/chartex" xmlns:cx1="http://schemas.microsoft.com/office/drawing/2015/9/8/chartex" xmlns:cx2="http://schemas.microsoft.com/office/drawing/2015/10/21/chartex" xmlns:cx3="http://schemas.microsoft.com/office/drawing/2016/5/9/chartex" xmlns:cx4="http://schemas.microsoft.com/office/drawing/2016/5/10/chartex" xmlns:cx5="http://schemas.microsoft.com/office/drawing/2016/5/11/chartex" xmlns:cx6="http://schemas.microsoft.com/office/drawing/2016/5/12/chartex" xmlns:cx7="http://schemas.microsoft.com/office/drawing/2016/5/13/chartex" xmlns:cx8="http://schemas.microsoft.com/office/drawing/2016/5/14/chartex" xmlns:mc="http://schemas.openxmlformats.org/markup-compatibility/2006" xmlns:aink="http://schemas.microsoft.com/office/drawing/2016/ink" xmlns:am3d="http://schemas.microsoft.com/office/drawing/2017/model3d" xmlns:o="urn:schemas-microsoft-com:office:office" xmlns:oel="http://schemas.microsoft.com/office/2019/extlst" xmlns:r="http://schemas.openxmlformats.org/officeDocument/2006/relationships" xmlns:m="http://schemas.openxmlformats.org/officeDocument/2006/math" xmlns:v="urn:schemas-microsoft-com:vml" xmlns:wp14="http://schemas.microsoft.com/office/word/2010/wordprocessingDrawing" xmlns:wp="http://schemas.openxmlformats.org/drawingml/2006/wordprocessingDrawing" xmlns:w10="urn:schemas-microsoft-com:office:word" xmlns:w="http://schemas.openxmlformats.org/wordprocessingml/2006/main" xmlns:w14="http://schemas.microsoft.com/office/word/2010/wordml" xmlns:w15="http://schemas.microsoft.com/office/word/2012/wordml" xmlns:w16cex="http://schemas.microsoft.com/office/word/2018/wordml/cex" xmlns:w16cid="http://schemas.microsoft.com/office/word/2016/wordml/cid" xmlns:w16="http://schemas.microsoft.com/office/word/2018/wordml" xmlns:w16sdtdh="http://schemas.microsoft.com/office/word/2020/wordml/sdtdatahash" xmlns:w16se="http://schemas.microsoft.com/office/word/2015/wordml/symex" xmlns:wpg="http://schemas.microsoft.com/office/word/2010/wordprocessingGroup" xmlns:wpi="http://schemas.microsoft.com/office/word/2010/wordprocessingInk" xmlns:wne="http://schemas.microsoft.com/office/word/2006/wordml" xmlns:wps="http://schemas.microsoft.com/office/word/2010/wordprocessingShape" mc:Ignorable="w14 w15 w16se w16cid w16 w16cex w16sdtdh wp14">
   <w:abstractNum w:abstractNumId="0" w15:restartNumberingAfterBreak="0">
     <w:nsid w:val="3ADC3D85"/>
     <w:multiLevelType w:val="hybridMultilevel"/>
@@ -1459,17 +2000,17 @@
       </w:rPr>
     </w:lvl>
   </w:abstractNum>
-  <w:num w:numId="1">
+  <w:num w:numId="1" w16cid:durableId="1761026316">
     <w:abstractNumId w:val="1"/>
   </w:num>
-  <w:num w:numId="2">
+  <w:num w:numId="2" w16cid:durableId="325282350">
     <w:abstractNumId w:val="0"/>
   </w:num>
 </w:numbering>
 </file>
 
 <file path=word/styles.xml><?xml version="1.0" encoding="utf-8"?>
-<w:styles xmlns:mc="http://schemas.openxmlformats.org/markup-compatibility/2006" xmlns:r="http://schemas.openxmlformats.org/officeDocument/2006/relationships" xmlns:w="http://schemas.openxmlformats.org/wordprocessingml/2006/main" xmlns:w14="http://schemas.microsoft.com/office/word/2010/wordml" xmlns:w15="http://schemas.microsoft.com/office/word/2012/wordml" xmlns:w16se="http://schemas.microsoft.com/office/word/2015/wordml/symex" mc:Ignorable="w14 w15 w16se">
+<w:styles xmlns:mc="http://schemas.openxmlformats.org/markup-compatibility/2006" xmlns:r="http://schemas.openxmlformats.org/officeDocument/2006/relationships" xmlns:w="http://schemas.openxmlformats.org/wordprocessingml/2006/main" xmlns:w14="http://schemas.microsoft.com/office/word/2010/wordml" xmlns:w15="http://schemas.microsoft.com/office/word/2012/wordml" xmlns:w16cex="http://schemas.microsoft.com/office/word/2018/wordml/cex" xmlns:w16cid="http://schemas.microsoft.com/office/word/2016/wordml/cid" xmlns:w16="http://schemas.microsoft.com/office/word/2018/wordml" xmlns:w16sdtdh="http://schemas.microsoft.com/office/word/2020/wordml/sdtdatahash" xmlns:w16se="http://schemas.microsoft.com/office/word/2015/wordml/symex" mc:Ignorable="w14 w15 w16se w16cid w16 w16cex w16sdtdh">
   <w:docDefaults>
     <w:rPrDefault>
       <w:rPr>
@@ -1479,7 +2020,7 @@
     </w:rPrDefault>
     <w:pPrDefault/>
   </w:docDefaults>
-  <w:latentStyles w:defLockedState="0" w:defUIPriority="99" w:defSemiHidden="0" w:defUnhideWhenUsed="0" w:defQFormat="0" w:count="371">
+  <w:latentStyles w:defLockedState="0" w:defUIPriority="99" w:defSemiHidden="0" w:defUnhideWhenUsed="0" w:defQFormat="0" w:count="376">
     <w:lsdException w:name="Normal" w:uiPriority="0" w:qFormat="1"/>
     <w:lsdException w:name="heading 1" w:uiPriority="9" w:qFormat="1"/>
     <w:lsdException w:name="heading 2" w:semiHidden="1" w:uiPriority="9" w:unhideWhenUsed="1" w:qFormat="1"/>
@@ -1848,6 +2389,11 @@
     <w:lsdException w:name="List Table 5 Dark Accent 6" w:uiPriority="50"/>
     <w:lsdException w:name="List Table 6 Colorful Accent 6" w:uiPriority="51"/>
     <w:lsdException w:name="List Table 7 Colorful Accent 6" w:uiPriority="52"/>
+    <w:lsdException w:name="Mention" w:semiHidden="1" w:unhideWhenUsed="1"/>
+    <w:lsdException w:name="Smart Hyperlink" w:semiHidden="1" w:unhideWhenUsed="1"/>
+    <w:lsdException w:name="Hashtag" w:semiHidden="1" w:unhideWhenUsed="1"/>
+    <w:lsdException w:name="Unresolved Mention" w:semiHidden="1" w:unhideWhenUsed="1"/>
+    <w:lsdException w:name="Smart Link" w:semiHidden="1" w:unhideWhenUsed="1"/>
   </w:latentStyles>
   <w:style w:type="paragraph" w:default="1" w:styleId="a">
     <w:name w:val="Normal"/>

</xml_diff>